<commit_message>
Chen 6 anh 3D co cau quay tam pin vao Chuong 3 quyen Che tao 2 truc kem mo ta; dung lai PDF
Co-authored-by: arena-agent <297053741+arena-agent@users.noreply.github.com>
</commit_message>
<xml_diff>
--- a/Bao_cao_2_truc_Che_tao.docx
+++ b/Bao_cao_2_truc_Che_tao.docx
@@ -683,7 +683,9 @@
         <w:pStyle w:val="Caption"/>
       </w:pPr>
       <w:r>
-        <w:rPr/>
+        <w:rPr>
+          <w:sz w:val="24"/>
+        </w:rPr>
         <w:t>Hình 1. Sơ đồ khối hệ thống hai trục theo phương pháp hybrid</w:t>
       </w:r>
     </w:p>
@@ -1229,6 +1231,115 @@
       </w:r>
     </w:p>
     <w:p>
+      <w:r>
+        <w:t>Cơ cấu bám hai trục được lắp từ ba cụm chính: chân đế ba chân kèm khớp phương vị ở gốc, thân trụ đứng mang càng cua khớp nâng trên đỉnh, và khung tấm pin bắt trên thanh đà. Động cơ gạt nước đặt tại gốc trụ quay toàn bộ trụ và tấm pin quanh trục thẳng đứng để dõi theo hướng nắng trong ngày; động cơ giảm tốc JGB37 gắn trên càng cua đỉnh trụ chỉnh góc nghiêng tấm pin qua trục nâng theo mùa. Cả hai động cơ đều có hộp giảm tốc tự hãm nên tấm pin giữ nguyên vị trí khi ngắt điện hoặc khi gió thổi mạnh.</w:t>
+      </w:r>
+    </w:p>
+    <w:p>
+      <w:r>
+        <w:drawing>
+          <wp:inline xmlns:a="http://schemas.openxmlformats.org/drawingml/2006/main" xmlns:pic="http://schemas.openxmlformats.org/drawingml/2006/picture">
+            <wp:extent cx="5120640" cy="4866424"/>
+            <wp:docPr id="2" name="Picture 2"/>
+            <wp:cNvGraphicFramePr>
+              <a:graphicFrameLocks noChangeAspect="1"/>
+            </wp:cNvGraphicFramePr>
+            <a:graphic>
+              <a:graphicData uri="http://schemas.openxmlformats.org/drawingml/2006/picture">
+                <pic:pic>
+                  <pic:nvPicPr>
+                    <pic:cNvPr id="0" name="toan_canh_truoc.jpg"/>
+                    <pic:cNvPicPr/>
+                  </pic:nvPicPr>
+                  <pic:blipFill>
+                    <a:blip r:embed="rId22"/>
+                    <a:stretch>
+                      <a:fillRect/>
+                    </a:stretch>
+                  </pic:blipFill>
+                  <pic:spPr>
+                    <a:xfrm>
+                      <a:off x="0" y="0"/>
+                      <a:ext cx="5120640" cy="4866424"/>
+                    </a:xfrm>
+                    <a:prstGeom prst="rect"/>
+                  </pic:spPr>
+                </pic:pic>
+              </a:graphicData>
+            </a:graphic>
+          </wp:inline>
+        </w:drawing>
+      </w:r>
+    </w:p>
+    <w:p>
+      <w:pPr>
+        <w:pStyle w:val="Caption"/>
+      </w:pPr>
+      <w:r>
+        <w:rPr>
+          <w:sz w:val="24"/>
+        </w:rPr>
+        <w:t>Hình 2. Toàn cảnh cơ cấu bám hai trục nhìn từ phía trước</w:t>
+      </w:r>
+    </w:p>
+    <w:p>
+      <w:r>
+        <w:t>Hình toàn cảnh mô hình nhìn từ phía trước: tấm pin 100 W bắt trên khung đà ngang được nâng bởi trụ đứng giữa ba chân đế; động cơ gạt nước phương vị đặt sát hub chân đế, quay toàn bộ trụ và tấm pin quanh trục thẳng đứng.</w:t>
+      </w:r>
+    </w:p>
+    <w:p>
+      <w:r>
+        <w:drawing>
+          <wp:inline xmlns:a="http://schemas.openxmlformats.org/drawingml/2006/main" xmlns:pic="http://schemas.openxmlformats.org/drawingml/2006/picture">
+            <wp:extent cx="5120640" cy="4987290"/>
+            <wp:docPr id="3" name="Picture 3"/>
+            <wp:cNvGraphicFramePr>
+              <a:graphicFrameLocks noChangeAspect="1"/>
+            </wp:cNvGraphicFramePr>
+            <a:graphic>
+              <a:graphicData uri="http://schemas.openxmlformats.org/drawingml/2006/picture">
+                <pic:pic>
+                  <pic:nvPicPr>
+                    <pic:cNvPr id="0" name="toan_canh_sau.jpg"/>
+                    <pic:cNvPicPr/>
+                  </pic:nvPicPr>
+                  <pic:blipFill>
+                    <a:blip r:embed="rId23"/>
+                    <a:stretch>
+                      <a:fillRect/>
+                    </a:stretch>
+                  </pic:blipFill>
+                  <pic:spPr>
+                    <a:xfrm>
+                      <a:off x="0" y="0"/>
+                      <a:ext cx="5120640" cy="4987290"/>
+                    </a:xfrm>
+                    <a:prstGeom prst="rect"/>
+                  </pic:spPr>
+                </pic:pic>
+              </a:graphicData>
+            </a:graphic>
+          </wp:inline>
+        </w:drawing>
+      </w:r>
+    </w:p>
+    <w:p>
+      <w:pPr>
+        <w:pStyle w:val="Caption"/>
+      </w:pPr>
+      <w:r>
+        <w:rPr>
+          <w:sz w:val="24"/>
+        </w:rPr>
+        <w:t>Hình 3. Toàn cảnh cơ cấu bám hai trục nhìn từ phía sau</w:t>
+      </w:r>
+    </w:p>
+    <w:p>
+      <w:r>
+        <w:t>Nhìn từ phía sau: giá khớp nâng kèm động cơ giảm tốc bắt ngay lưng tấm pin để chỉnh góc ngẩng; động cơ phương vị ở gốc trụ nối vào hub chân đế, dây động cơ chạy dọc thân trụ lên hộp điều khiển.</w:t>
+      </w:r>
+    </w:p>
+    <w:p>
       <w:pPr>
         <w:pStyle w:val="Heading2"/>
       </w:pPr>
@@ -1272,6 +1383,58 @@
       <w:r>
         <w:rPr/>
         <w:t>Biến trở hồi tiếp của mỗi khớp gắn đồng trục phía đối diện motor; bốn công tắc hành trình gá trên đế và thân quay tại vị trí chặn cơ khí.</w:t>
+      </w:r>
+    </w:p>
+    <w:p>
+      <w:r>
+        <w:drawing>
+          <wp:inline xmlns:a="http://schemas.openxmlformats.org/drawingml/2006/main" xmlns:pic="http://schemas.openxmlformats.org/drawingml/2006/picture">
+            <wp:extent cx="4023360" cy="4612144"/>
+            <wp:docPr id="4" name="Picture 4"/>
+            <wp:cNvGraphicFramePr>
+              <a:graphicFrameLocks noChangeAspect="1"/>
+            </wp:cNvGraphicFramePr>
+            <a:graphic>
+              <a:graphicData uri="http://schemas.openxmlformats.org/drawingml/2006/picture">
+                <pic:pic>
+                  <pic:nvPicPr>
+                    <pic:cNvPr id="0" name="chan_ba_va_khop_phuong_vi.jpg"/>
+                    <pic:cNvPicPr/>
+                  </pic:nvPicPr>
+                  <pic:blipFill>
+                    <a:blip r:embed="rId24"/>
+                    <a:stretch>
+                      <a:fillRect/>
+                    </a:stretch>
+                  </pic:blipFill>
+                  <pic:spPr>
+                    <a:xfrm>
+                      <a:off x="0" y="0"/>
+                      <a:ext cx="4023360" cy="4612144"/>
+                    </a:xfrm>
+                    <a:prstGeom prst="rect"/>
+                  </pic:spPr>
+                </pic:pic>
+              </a:graphicData>
+            </a:graphic>
+          </wp:inline>
+        </w:drawing>
+      </w:r>
+    </w:p>
+    <w:p>
+      <w:pPr>
+        <w:pStyle w:val="Caption"/>
+      </w:pPr>
+      <w:r>
+        <w:rPr>
+          <w:sz w:val="24"/>
+        </w:rPr>
+        <w:t>Hình 4. Chân đế ba chân và ổ khớp phương vị</w:t>
+      </w:r>
+    </w:p>
+    <w:p>
+      <w:r>
+        <w:t>Chân đế ba chân và ổ khớp phương vị: ba chân thép liên kết bằng đai giằng dưới, hub trên khoan lỗ tròn lồng ổ trục và bắt giá động cơ phương vị; các mặt phẳng chuẩn trong bản vẽ dùng để ràng buộc vị trí khi lắp cụm chân.</w:t>
       </w:r>
     </w:p>
     <w:p>
@@ -2137,6 +2300,110 @@
       </w:r>
     </w:p>
     <w:p>
+      <w:r>
+        <w:drawing>
+          <wp:inline xmlns:a="http://schemas.openxmlformats.org/drawingml/2006/main" xmlns:pic="http://schemas.openxmlformats.org/drawingml/2006/picture">
+            <wp:extent cx="4754880" cy="3192843"/>
+            <wp:docPr id="5" name="Picture 5"/>
+            <wp:cNvGraphicFramePr>
+              <a:graphicFrameLocks noChangeAspect="1"/>
+            </wp:cNvGraphicFramePr>
+            <a:graphic>
+              <a:graphicData uri="http://schemas.openxmlformats.org/drawingml/2006/picture">
+                <pic:pic>
+                  <pic:nvPicPr>
+                    <pic:cNvPr id="0" name="dong_co_gat_nuoc.jpg"/>
+                    <pic:cNvPicPr/>
+                  </pic:nvPicPr>
+                  <pic:blipFill>
+                    <a:blip r:embed="rId25"/>
+                    <a:stretch>
+                      <a:fillRect/>
+                    </a:stretch>
+                  </pic:blipFill>
+                  <pic:spPr>
+                    <a:xfrm>
+                      <a:off x="0" y="0"/>
+                      <a:ext cx="4754880" cy="3192843"/>
+                    </a:xfrm>
+                    <a:prstGeom prst="rect"/>
+                  </pic:spPr>
+                </pic:pic>
+              </a:graphicData>
+            </a:graphic>
+          </wp:inline>
+        </w:drawing>
+      </w:r>
+    </w:p>
+    <w:p>
+      <w:pPr>
+        <w:pStyle w:val="Caption"/>
+      </w:pPr>
+      <w:r>
+        <w:rPr>
+          <w:sz w:val="24"/>
+        </w:rPr>
+        <w:t>Hình 5. Động cơ gạt nước 12 V cho trục phương vị</w:t>
+      </w:r>
+    </w:p>
+    <w:p>
+      <w:r>
+        <w:t>Động cơ gạt nước 12 V cho trục phương vị: thân hộp bánh đúc có ba tai bắt bulông, trục ra then hoa tự hãm giữ tấm pin không trôi khi ngắt điện; hai cực nguồn dạng cắm nhanh nối sang mạch cầu H bốn TIP41C.</w:t>
+      </w:r>
+    </w:p>
+    <w:p>
+      <w:r>
+        <w:drawing>
+          <wp:inline xmlns:a="http://schemas.openxmlformats.org/drawingml/2006/main" xmlns:pic="http://schemas.openxmlformats.org/drawingml/2006/picture">
+            <wp:extent cx="4206240" cy="3178519"/>
+            <wp:docPr id="6" name="Picture 6"/>
+            <wp:cNvGraphicFramePr>
+              <a:graphicFrameLocks noChangeAspect="1"/>
+            </wp:cNvGraphicFramePr>
+            <a:graphic>
+              <a:graphicData uri="http://schemas.openxmlformats.org/drawingml/2006/picture">
+                <pic:pic>
+                  <pic:nvPicPr>
+                    <pic:cNvPr id="0" name="dong_co_jgb37.jpg"/>
+                    <pic:cNvPicPr/>
+                  </pic:nvPicPr>
+                  <pic:blipFill>
+                    <a:blip r:embed="rId26"/>
+                    <a:stretch>
+                      <a:fillRect/>
+                    </a:stretch>
+                  </pic:blipFill>
+                  <pic:spPr>
+                    <a:xfrm>
+                      <a:off x="0" y="0"/>
+                      <a:ext cx="4206240" cy="3178519"/>
+                    </a:xfrm>
+                    <a:prstGeom prst="rect"/>
+                  </pic:spPr>
+                </pic:pic>
+              </a:graphicData>
+            </a:graphic>
+          </wp:inline>
+        </w:drawing>
+      </w:r>
+    </w:p>
+    <w:p>
+      <w:pPr>
+        <w:pStyle w:val="Caption"/>
+      </w:pPr>
+      <w:r>
+        <w:rPr>
+          <w:sz w:val="24"/>
+        </w:rPr>
+        <w:t>Hình 6. Động cơ giảm tốc JGB37 cho trục nâng nghiêng</w:t>
+      </w:r>
+    </w:p>
+    <w:p>
+      <w:r>
+        <w:t>Động cơ giảm tốc JGB37 cho trục nâng nghiêng: hộp giảm tốc mặt bích tròn có vòng vít bắt vào giá càng cua, trục ra trơn nối chốt quay của thanh đà; tốc độ quay thấp, mô-men lớn phù hợp nâng hạ chậm tấm pin nặng khoảng 4 kg.</w:t>
+      </w:r>
+    </w:p>
+    <w:p>
       <w:pPr>
         <w:pStyle w:val="Heading2"/>
       </w:pPr>
@@ -2297,6 +2564,58 @@
           <w:color w:val="000000"/>
         </w:rPr>
         <w:t>Các chi tiết in 3D gồm khối gá bốn LDR nghiêng β_s, ốp khớp phương vị, tay đòn khớp nâng; vật liệu PETG điền đầy 40%. Danh mục chi tiết cơ khí và bản vẽ từng part liệt kê ở mục 3.6 và mục 4.2.</w:t>
+      </w:r>
+    </w:p>
+    <w:p>
+      <w:r>
+        <w:drawing>
+          <wp:inline xmlns:a="http://schemas.openxmlformats.org/drawingml/2006/main" xmlns:pic="http://schemas.openxmlformats.org/drawingml/2006/picture">
+            <wp:extent cx="4572000" cy="3653034"/>
+            <wp:docPr id="7" name="Picture 7"/>
+            <wp:cNvGraphicFramePr>
+              <a:graphicFrameLocks noChangeAspect="1"/>
+            </wp:cNvGraphicFramePr>
+            <a:graphic>
+              <a:graphicData uri="http://schemas.openxmlformats.org/drawingml/2006/picture">
+                <pic:pic>
+                  <pic:nvPicPr>
+                    <pic:cNvPr id="0" name="thanh_da_mang_pin.jpg"/>
+                    <pic:cNvPicPr/>
+                  </pic:nvPicPr>
+                  <pic:blipFill>
+                    <a:blip r:embed="rId27"/>
+                    <a:stretch>
+                      <a:fillRect/>
+                    </a:stretch>
+                  </pic:blipFill>
+                  <pic:spPr>
+                    <a:xfrm>
+                      <a:off x="0" y="0"/>
+                      <a:ext cx="4572000" cy="3653034"/>
+                    </a:xfrm>
+                    <a:prstGeom prst="rect"/>
+                  </pic:spPr>
+                </pic:pic>
+              </a:graphicData>
+            </a:graphic>
+          </wp:inline>
+        </w:drawing>
+      </w:r>
+    </w:p>
+    <w:p>
+      <w:pPr>
+        <w:pStyle w:val="Caption"/>
+      </w:pPr>
+      <w:r>
+        <w:rPr>
+          <w:sz w:val="24"/>
+        </w:rPr>
+        <w:t>Hình 7. Thanh đà mang tấm pin</w:t>
+      </w:r>
+    </w:p>
+    <w:p>
+      <w:r>
+        <w:t>Thanh đà mang pin: mác thép gấp mép có lỗ bắt vít vào khung tấm pin ở hai đầu, chốt xoay giữa đà lồng vào giá càng cua để tấm pin quay đúng tâm khớp nâng và cân mô-men trọng trường.</w:t>
       </w:r>
     </w:p>
     <w:p>

</xml_diff>